<commit_message>
docs: add two new chapters to trading system notes
Added 'Trade journal Dec-Jan review' (ICT/Smart Money approach) and
'99% will lose in 2026' (RAS neuroscience, goal setting, affirmations).

Co-Authored-By: Claude Sonnet 4.6 <noreply@anthropic.com>
</commit_message>
<xml_diff>
--- a/docs/Торговая система.docx
+++ b/docs/Торговая система.docx
@@ -2468,6 +2468,986 @@
           <w:i/>
         </w:rPr>
         <w:t>Документ составлен на основе видеоматериалов трейдера Романа</w:t>
+      </w:r>
+    </w:p>
+    <w:p>
+      <w:r>
+        <w:t>────────────────────────────────────────</w:t>
+      </w:r>
+    </w:p>
+    <w:p>
+      <w:pPr>
+        <w:pStyle w:val="Heading2"/>
+      </w:pPr>
+      <w:r>
+        <w:t>Простая стратегия, которая кормит меня всю жизнь: разбор сделок</w:t>
+      </w:r>
+    </w:p>
+    <w:p>
+      <w:pPr>
+        <w:pStyle w:val="Heading3"/>
+      </w:pPr>
+      <w:r>
+        <w:t>Обзор периода декабрь-январь</w:t>
+      </w:r>
+    </w:p>
+    <w:p>
+      <w:r>
+        <w:t>Разбор реальных сделок за декабрь-январь: биткоин, форекс-инструменты. В совокупности несколько тысяч долларов профита при двух зафиксированных стопах. Все сделки ведутся через торговый дневник, большинство лимитными ордерами, заранее опубликованы в Telegram-канале и клубе.</w:t>
+      </w:r>
+    </w:p>
+    <w:p>
+      <w:pPr>
+        <w:pStyle w:val="Heading3"/>
+      </w:pPr>
+      <w:r>
+        <w:t>Сделка 1 - BTCUSD (лонг, декабрь)</w:t>
+      </w:r>
+    </w:p>
+    <w:p>
+      <w:r>
+        <w:t>Результат: +2000 долларов, сделка длилась около 2 недель перед Новым годом.</w:t>
+      </w:r>
+    </w:p>
+    <w:p>
+      <w:pPr>
+        <w:pStyle w:val="ListBullet"/>
+      </w:pPr>
+      <w:r>
+        <w:t>На дневном таймфрейме цена находится в зоне покупок.</w:t>
+      </w:r>
+    </w:p>
+    <w:p>
+      <w:pPr>
+        <w:pStyle w:val="ListBullet"/>
+      </w:pPr>
+      <w:r>
+        <w:t>На более младшем таймфрейме - полноценный слом структуры и разворотный сетап.</w:t>
+      </w:r>
+    </w:p>
+    <w:p>
+      <w:pPr>
+        <w:pStyle w:val="ListBullet"/>
+      </w:pPr>
+      <w:r>
+        <w:t>Ждал коррекцию к имбалансу. Вход лимитным ордером.</w:t>
+      </w:r>
+    </w:p>
+    <w:p>
+      <w:pPr>
+        <w:pStyle w:val="ListBullet"/>
+      </w:pPr>
+      <w:r>
+        <w:t>Цель - обновление ближайшей ликвидности.</w:t>
+      </w:r>
+    </w:p>
+    <w:p>
+      <w:r>
+        <w:t>Сделка эмоционально тяжёлая: цена две недели колебалась в диапазоне. Держал без изменений - только стоп или тейк, никаких ранних выходов.</w:t>
+      </w:r>
+    </w:p>
+    <w:p>
+      <w:pPr>
+        <w:pStyle w:val="Heading3"/>
+      </w:pPr>
+      <w:r>
+        <w:t>Сделка 2 - BTCUSD (шорт, январь)</w:t>
+      </w:r>
+    </w:p>
+    <w:p>
+      <w:r>
+        <w:t>Результат: +3000 долларов, сделка длилась около 6 дней.</w:t>
+      </w:r>
+    </w:p>
+    <w:p>
+      <w:pPr>
+        <w:pStyle w:val="ListBullet"/>
+      </w:pPr>
+      <w:r>
+        <w:t>Зона 97-98k: имбаланс + очевидные равные максимумы + скопление ликвидности.</w:t>
+      </w:r>
+    </w:p>
+    <w:p>
+      <w:pPr>
+        <w:pStyle w:val="ListBullet"/>
+      </w:pPr>
+      <w:r>
+        <w:t>Область - сильная зона для продаж.</w:t>
+      </w:r>
+    </w:p>
+    <w:p>
+      <w:pPr>
+        <w:pStyle w:val="ListBullet"/>
+      </w:pPr>
+      <w:r>
+        <w:t>Вход лимитным ордером прямо в зону.</w:t>
+      </w:r>
+    </w:p>
+    <w:p>
+      <w:pPr>
+        <w:pStyle w:val="ListBullet"/>
+      </w:pPr>
+      <w:r>
+        <w:t>Там же, где закрывал предыдущий лонг, - вошёл в шорт.</w:t>
+      </w:r>
+    </w:p>
+    <w:p>
+      <w:pPr>
+        <w:pStyle w:val="ListBullet"/>
+      </w:pPr>
+      <w:r>
+        <w:t>Цели ещё ниже около 86k не достигнуты: вышел на импульсе через 6 дней.</w:t>
+      </w:r>
+    </w:p>
+    <w:p>
+      <w:pPr>
+        <w:pStyle w:val="Heading3"/>
+      </w:pPr>
+      <w:r>
+        <w:t>Сделка 3 - USDJPY (шорт, январь)</w:t>
+      </w:r>
+    </w:p>
+    <w:p>
+      <w:r>
+        <w:t>Результат: профит, соотношение около 1:1.5+.</w:t>
+      </w:r>
+    </w:p>
+    <w:p>
+      <w:pPr>
+        <w:pStyle w:val="ListBullet"/>
+      </w:pPr>
+      <w:r>
+        <w:t>Цена во флете. Равные максимумы и равные минимумы.</w:t>
+      </w:r>
+    </w:p>
+    <w:p>
+      <w:pPr>
+        <w:pStyle w:val="ListBullet"/>
+      </w:pPr>
+      <w:r>
+        <w:t>Структурно цена поджимается к хаям и рисует разворотные формации.</w:t>
+      </w:r>
+    </w:p>
+    <w:p>
+      <w:pPr>
+        <w:pStyle w:val="ListBullet"/>
+      </w:pPr>
+      <w:r>
+        <w:t>Снятие ликвидности над равными максимумами - вход лимитным ордером.</w:t>
+      </w:r>
+    </w:p>
+    <w:p>
+      <w:pPr>
+        <w:pStyle w:val="ListBullet"/>
+      </w:pPr>
+      <w:r>
+        <w:t>Фиксированный стоп-лосс, взял и забыл.</w:t>
+      </w:r>
+    </w:p>
+    <w:p>
+      <w:pPr>
+        <w:pStyle w:val="Heading3"/>
+      </w:pPr>
+      <w:r>
+        <w:t>Сделка 4 - EURUSD (шорт, 14 января)</w:t>
+      </w:r>
+    </w:p>
+    <w:p>
+      <w:r>
+        <w:t>Результат: около 1:3 к стопу.</w:t>
+      </w:r>
+    </w:p>
+    <w:p>
+      <w:pPr>
+        <w:pStyle w:val="ListBullet"/>
+      </w:pPr>
+      <w:r>
+        <w:t>Равные минимумы - скопление ликвидности, цена туда будет двигаться.</w:t>
+      </w:r>
+    </w:p>
+    <w:p>
+      <w:pPr>
+        <w:pStyle w:val="ListBullet"/>
+      </w:pPr>
+      <w:r>
+        <w:t>Классический структурный разворотный сетап: движение - коррекция в discount-зону - вход.</w:t>
+      </w:r>
+    </w:p>
+    <w:p>
+      <w:pPr>
+        <w:pStyle w:val="ListBullet"/>
+      </w:pPr>
+      <w:r>
+        <w:t>Понятный стоп, понятный тейк. Одна из самых чистых сделок за период.</w:t>
+      </w:r>
+    </w:p>
+    <w:p>
+      <w:pPr>
+        <w:pStyle w:val="Heading3"/>
+      </w:pPr>
+      <w:r>
+        <w:t>Сделка 5 - GBPUSD (лонг, 8 января)</w:t>
+      </w:r>
+    </w:p>
+    <w:p>
+      <w:r>
+        <w:t>Результат: +2000 долларов, около 1 суток в позиции.</w:t>
+      </w:r>
+    </w:p>
+    <w:p>
+      <w:pPr>
+        <w:pStyle w:val="ListBullet"/>
+      </w:pPr>
+      <w:r>
+        <w:t>Цена падает к сильному структурному уровню.</w:t>
+      </w:r>
+    </w:p>
+    <w:p>
+      <w:pPr>
+        <w:pStyle w:val="ListBullet"/>
+      </w:pPr>
+      <w:r>
+        <w:t>Цель: взять первую реакцию на уровень, не пытаться поймать всё движение.</w:t>
+      </w:r>
+    </w:p>
+    <w:p>
+      <w:pPr>
+        <w:pStyle w:val="ListBullet"/>
+      </w:pPr>
+      <w:r>
+        <w:t>Соотношение около 1:1.5-1:2, сделка закрылась быстро.</w:t>
+      </w:r>
+    </w:p>
+    <w:p>
+      <w:pPr>
+        <w:pStyle w:val="ListBullet"/>
+      </w:pPr>
+      <w:r>
+        <w:t>Вход лимитным ордером заранее.</w:t>
+      </w:r>
+    </w:p>
+    <w:p>
+      <w:pPr>
+        <w:pStyle w:val="Heading3"/>
+      </w:pPr>
+      <w:r>
+        <w:t>Сделки 6 и 7 - AUDUSD (два стопа)</w:t>
+      </w:r>
+    </w:p>
+    <w:p>
+      <w:r>
+        <w:t>Результат: -1000 и -1000 долларов.</w:t>
+      </w:r>
+    </w:p>
+    <w:p>
+      <w:pPr>
+        <w:pStyle w:val="ListBullet"/>
+      </w:pPr>
+      <w:r>
+        <w:t>Оба раза - полноценная разворотная формация: снятие индюсмента, вход в шорт.</w:t>
+      </w:r>
+    </w:p>
+    <w:p>
+      <w:pPr>
+        <w:pStyle w:val="ListBullet"/>
+      </w:pPr>
+      <w:r>
+        <w:t>Первый: цена пошла в нужную сторону, затем вернулась и закрыла по стопу. Систему не нарушал - только стоп или тейк.</w:t>
+      </w:r>
+    </w:p>
+    <w:p>
+      <w:pPr>
+        <w:pStyle w:val="ListBullet"/>
+      </w:pPr>
+      <w:r>
+        <w:t>Второй: цена обновила максимумы, снова шорт с расчётом 1:3 - снова стоп.</w:t>
+      </w:r>
+    </w:p>
+    <w:p>
+      <w:pPr>
+        <w:pStyle w:val="ListBullet"/>
+      </w:pPr>
+      <w:r>
+        <w:t>Вывод: это статистика, а не сигнал менять стратегию.</w:t>
+      </w:r>
+    </w:p>
+    <w:p>
+      <w:pPr>
+        <w:pStyle w:val="Heading3"/>
+      </w:pPr>
+      <w:r>
+        <w:t>Сделка 8 - USDJPY (лонг, 21 января)</w:t>
+      </w:r>
+    </w:p>
+    <w:p>
+      <w:r>
+        <w:t>Результат: +2000 долларов.</w:t>
+      </w:r>
+    </w:p>
+    <w:p>
+      <w:pPr>
+        <w:pStyle w:val="ListBullet"/>
+      </w:pPr>
+      <w:r>
+        <w:t>Верхняя граница диапазона снята - цена должна двигаться к нижней.</w:t>
+      </w:r>
+    </w:p>
+    <w:p>
+      <w:pPr>
+        <w:pStyle w:val="ListBullet"/>
+      </w:pPr>
+      <w:r>
+        <w:t>Пока формируется разворотная структура - взял небольшой лонг.</w:t>
+      </w:r>
+    </w:p>
+    <w:p>
+      <w:pPr>
+        <w:pStyle w:val="ListBullet"/>
+      </w:pPr>
+      <w:r>
+        <w:t>Ордерблок (зона покупок) как точка входа.</w:t>
+      </w:r>
+    </w:p>
+    <w:p>
+      <w:pPr>
+        <w:pStyle w:val="ListBullet"/>
+      </w:pPr>
+      <w:r>
+        <w:t>Цель: снятие ближнего IDM (inducement). Отработало точно.</w:t>
+      </w:r>
+    </w:p>
+    <w:p>
+      <w:pPr>
+        <w:pStyle w:val="Heading3"/>
+      </w:pPr>
+      <w:r>
+        <w:t>Ключевые принципы по итогам разбора</w:t>
+      </w:r>
+    </w:p>
+    <w:p>
+      <w:r>
+        <w:rPr>
+          <w:b/>
+        </w:rPr>
+        <w:t xml:space="preserve">Лимитные ордера: </w:t>
+      </w:r>
+      <w:r>
+        <w:t>Большинство сделок ставится заранее, без входа по рынку</w:t>
+      </w:r>
+    </w:p>
+    <w:p>
+      <w:r>
+        <w:rPr>
+          <w:b/>
+        </w:rPr>
+        <w:t xml:space="preserve">Только стоп или тейк: </w:t>
+      </w:r>
+      <w:r>
+        <w:t>Никаких досрочных ручных закрытий - ломает математику</w:t>
+      </w:r>
+    </w:p>
+    <w:p>
+      <w:r>
+        <w:rPr>
+          <w:b/>
+        </w:rPr>
+        <w:t xml:space="preserve">Торговый дневник: </w:t>
+      </w:r>
+      <w:r>
+        <w:t>Каждая сделка: точка входа, точка выхода, логика, результат</w:t>
+      </w:r>
+    </w:p>
+    <w:p>
+      <w:r>
+        <w:rPr>
+          <w:b/>
+        </w:rPr>
+        <w:t xml:space="preserve">Структурный контекст: </w:t>
+      </w:r>
+      <w:r>
+        <w:t>Старший таймфрейм задаёт зону; младший - точку входа</w:t>
+      </w:r>
+    </w:p>
+    <w:p>
+      <w:r>
+        <w:rPr>
+          <w:b/>
+        </w:rPr>
+        <w:t xml:space="preserve">Стопы - часть системы: </w:t>
+      </w:r>
+      <w:r>
+        <w:t>Два стопа подряд не повод менять стратегию - это нормальная статистика</w:t>
+      </w:r>
+    </w:p>
+    <w:p>
+      <w:pPr>
+        <w:pStyle w:val="Heading3"/>
+      </w:pPr>
+      <w:r>
+        <w:t>Инструменты анализа (ICT / Smart Money)</w:t>
+      </w:r>
+    </w:p>
+    <w:p>
+      <w:r>
+        <w:rPr>
+          <w:b/>
+        </w:rPr>
+        <w:t xml:space="preserve">Имбаланс (FVG) - </w:t>
+      </w:r>
+      <w:r>
+        <w:t>незаполненный ценовой разрыв, к которому цена стремится вернуться</w:t>
+      </w:r>
+    </w:p>
+    <w:p>
+      <w:r>
+        <w:rPr>
+          <w:b/>
+        </w:rPr>
+        <w:t xml:space="preserve">Ордерблок - </w:t>
+      </w:r>
+      <w:r>
+        <w:t>зона, откуда был совершён сильный импульс; работает как поддержка/сопротивление</w:t>
+      </w:r>
+    </w:p>
+    <w:p>
+      <w:r>
+        <w:rPr>
+          <w:b/>
+        </w:rPr>
+        <w:t xml:space="preserve">Равные максимумы и минимумы - </w:t>
+      </w:r>
+      <w:r>
+        <w:t>скопление стоп-ордеров толпы; цена идёт туда, чтобы снять ликвидность</w:t>
+      </w:r>
+    </w:p>
+    <w:p>
+      <w:r>
+        <w:rPr>
+          <w:b/>
+        </w:rPr>
+        <w:t xml:space="preserve">Индюсмент (IDM) - </w:t>
+      </w:r>
+      <w:r>
+        <w:t>ложный пробой перед основным движением</w:t>
+      </w:r>
+    </w:p>
+    <w:p>
+      <w:r>
+        <w:rPr>
+          <w:b/>
+        </w:rPr>
+        <w:t xml:space="preserve">Структурный слом (BOS) - </w:t>
+      </w:r>
+      <w:r>
+        <w:t>смена направления тренда, подтверждение разворота</w:t>
+      </w:r>
+    </w:p>
+    <w:p>
+      <w:r>
+        <w:rPr>
+          <w:b/>
+        </w:rPr>
+        <w:t xml:space="preserve">Discount / Premium зоны - </w:t>
+      </w:r>
+      <w:r>
+        <w:t>покупки ниже середины диапазона, продажи выше</w:t>
+      </w:r>
+    </w:p>
+    <w:p>
+      <w:r>
+        <w:t>Раздел составлен на основе видеоразбора сделок декабрь-январь</w:t>
+      </w:r>
+    </w:p>
+    <w:p>
+      <w:r>
+        <w:t>────────────────────────────────────────</w:t>
+      </w:r>
+    </w:p>
+    <w:p>
+      <w:pPr>
+        <w:pStyle w:val="Heading2"/>
+      </w:pPr>
+      <w:r>
+        <w:t>99% трейдеров потеряют всё в 2026 (и как попасть в 1%)</w:t>
+      </w:r>
+    </w:p>
+    <w:p>
+      <w:pPr>
+        <w:pStyle w:val="Heading3"/>
+      </w:pPr>
+      <w:r>
+        <w:t>Главная идея</w:t>
+      </w:r>
+    </w:p>
+    <w:p>
+      <w:r>
+        <w:t>Почему у большинства людей не получается достигать целей - объясняется не ленью и не отсутствием стратегии, а тем, как устроен мозг. Понимая механику работы РАС, можно перепрошить своё восприятие реальности.</w:t>
+      </w:r>
+    </w:p>
+    <w:p>
+      <w:pPr>
+        <w:pStyle w:val="Heading3"/>
+      </w:pPr>
+      <w:r>
+        <w:t>РАС - ваш главный секрет</w:t>
+      </w:r>
+    </w:p>
+    <w:p>
+      <w:r>
+        <w:t>РАС (ретикулярная активирующая система) - пучок нервных волокон в стволе головного мозга. Задача: фильтрация входящей информации.</w:t>
+      </w:r>
+    </w:p>
+    <w:p>
+      <w:pPr>
+        <w:pStyle w:val="ListBullet"/>
+      </w:pPr>
+      <w:r>
+        <w:t>Мозг обрабатывает 400 млн бит информации в секунду</w:t>
+      </w:r>
+    </w:p>
+    <w:p>
+      <w:pPr>
+        <w:pStyle w:val="ListBullet"/>
+      </w:pPr>
+      <w:r>
+        <w:t>Вы осознаёте только 2 000 бит</w:t>
+      </w:r>
+    </w:p>
+    <w:p>
+      <w:pPr>
+        <w:pStyle w:val="ListBullet"/>
+      </w:pPr>
+      <w:r>
+        <w:t>РАС отфильтровывает 99,999% всего, что происходит вокруг</w:t>
+      </w:r>
+    </w:p>
+    <w:p>
+      <w:r>
+        <w:t>РАС не знает разницы между важным и неважным - она ищет только то, что соответствует вашим доминирующим мыслям и убеждениям.</w:t>
+      </w:r>
+    </w:p>
+    <w:p>
+      <w:r>
+        <w:t>Пример: как только вы решаете купить красный Prius, вы начинаете видеть его везде. Машин не стало больше - изменился фильтр вашего мозга.</w:t>
+      </w:r>
+    </w:p>
+    <w:p>
+      <w:r>
+        <w:t>Ключевое: РАС ищет шаблоны, соответствующие вашим мыслям, неважно позитивные или негативные. Поэтому нельзя ставить цели с частицей не - мозг её не видит.</w:t>
+      </w:r>
+    </w:p>
+    <w:p>
+      <w:r>
+        <w:rPr>
+          <w:b/>
+        </w:rPr>
+        <w:t>Формулировки:</w:t>
+      </w:r>
+    </w:p>
+    <w:p>
+      <w:pPr>
+        <w:pStyle w:val="ListBullet"/>
+      </w:pPr>
+      <w:r>
+        <w:t>Я не хочу болеть -&gt; мозг видит болезнь</w:t>
+      </w:r>
+    </w:p>
+    <w:p>
+      <w:pPr>
+        <w:pStyle w:val="ListBullet"/>
+      </w:pPr>
+      <w:r>
+        <w:t>Я здоровый -&gt; мозг видит здоровье</w:t>
+      </w:r>
+    </w:p>
+    <w:p>
+      <w:pPr>
+        <w:pStyle w:val="ListBullet"/>
+      </w:pPr>
+      <w:r>
+        <w:t>Я брошу курить -&gt; мозг видит курение</w:t>
+      </w:r>
+    </w:p>
+    <w:p>
+      <w:pPr>
+        <w:pStyle w:val="ListBullet"/>
+      </w:pPr>
+      <w:r>
+        <w:t>Я некурящий со свежим дыханием -&gt; мозг видит здоровые лёгкие</w:t>
+      </w:r>
+    </w:p>
+    <w:p>
+      <w:r>
+        <w:t>Вашей РАС не нужно знать, КАК достичь цели. Ей нужно только знать НАПРАВЛЕНИЕ. Как GPS: вводите адрес - маршрут строится сам.</w:t>
+      </w:r>
+    </w:p>
+    <w:p>
+      <w:pPr>
+        <w:pStyle w:val="Heading3"/>
+      </w:pPr>
+      <w:r>
+        <w:t>Шаг 1 - Решить, чего вы хотите</w:t>
+      </w:r>
+    </w:p>
+    <w:p>
+      <w:r>
+        <w:t>Большинство людей не знает, чего они хотят на самом деле. Это главный тормоз.</w:t>
+      </w:r>
+    </w:p>
+    <w:p>
+      <w:r>
+        <w:t>Притча о рыбаке: рыбак живёт у моря, ловит рыбу, отдыхает. Американец с MBA объясняет строить бизнес 25 лет, а потом жить у моря. Рыбак: «Так я это уже делаю». Посыл: сначала поймите, что вы реально хотите.</w:t>
+      </w:r>
+    </w:p>
+    <w:p>
+      <w:r>
+        <w:rPr>
+          <w:b/>
+        </w:rPr>
+        <w:t>Практика:</w:t>
+      </w:r>
+    </w:p>
+    <w:p>
+      <w:pPr>
+        <w:pStyle w:val="ListBullet"/>
+      </w:pPr>
+      <w:r>
+        <w:t>Взять блокнот (не телефон, не компьютер)</w:t>
+      </w:r>
+    </w:p>
+    <w:p>
+      <w:pPr>
+        <w:pStyle w:val="ListBullet"/>
+      </w:pPr>
+      <w:r>
+        <w:t>Написать от руки список желаний от 10 до 300 штук</w:t>
+      </w:r>
+    </w:p>
+    <w:p>
+      <w:pPr>
+        <w:pStyle w:val="ListBullet"/>
+      </w:pPr>
+      <w:r>
+        <w:t>Писать именно желания, а не обязанности</w:t>
+      </w:r>
+    </w:p>
+    <w:p>
+      <w:r>
+        <w:t>Почему от руки: физический акт письма на 42% повышает вероятность достижения цели. Ручное письмо задействует до 10 000 движений; печатание - около 8. Письмо активирует РАС и программирует подсознание.</w:t>
+      </w:r>
+    </w:p>
+    <w:p>
+      <w:r>
+        <w:rPr>
+          <w:b/>
+        </w:rPr>
+        <w:t>Как формулировать цель:</w:t>
+      </w:r>
+    </w:p>
+    <w:p>
+      <w:pPr>
+        <w:pStyle w:val="ListBullet"/>
+      </w:pPr>
+      <w:r>
+        <w:t>Трудно достижимая, но легко представляемая - ключевой секрет</w:t>
+      </w:r>
+    </w:p>
+    <w:p>
+      <w:pPr>
+        <w:pStyle w:val="ListBullet"/>
+      </w:pPr>
+      <w:r>
+        <w:t>По системе SMART: конкретная, измеримая, достижимая, релевантная, с дедлайном</w:t>
+      </w:r>
+    </w:p>
+    <w:p>
+      <w:pPr>
+        <w:pStyle w:val="ListBullet"/>
+      </w:pPr>
+      <w:r>
+        <w:t>Пример: «К 15 августа 2030 года у меня 1 млн долларов чистых активов и полная свобода от долгов»</w:t>
+      </w:r>
+    </w:p>
+    <w:p>
+      <w:pPr>
+        <w:pStyle w:val="ListBullet"/>
+      </w:pPr>
+      <w:r>
+        <w:t>Без частицы не, в настоящем времени, с чёткой визуализацией</w:t>
+      </w:r>
+    </w:p>
+    <w:p>
+      <w:pPr>
+        <w:pStyle w:val="Heading3"/>
+      </w:pPr>
+      <w:r>
+        <w:t>Шаг 2 - Дедлайны и слайды</w:t>
+      </w:r>
+    </w:p>
+    <w:p>
+      <w:r>
+        <w:t>Финальный слайд - акт визуализации идеального будущего. Полная живая картинка: цвет, звук, запах, тактильные ощущения. Важно: без желания обладать.</w:t>
+      </w:r>
+    </w:p>
+    <w:p>
+      <w:r>
+        <w:t>Почему нельзя сильно желать: в трансёрфинге это называется избыточный потенциал. Равновесные силы уравновешивают и разрушают то, чего вы слишком сильно хотите или боитесь.</w:t>
+      </w:r>
+    </w:p>
+    <w:p>
+      <w:r>
+        <w:rPr>
+          <w:b/>
+        </w:rPr>
+        <w:t>Трансфертная цепочка:</w:t>
+      </w:r>
+    </w:p>
+    <w:p>
+      <w:pPr>
+        <w:pStyle w:val="ListBullet"/>
+      </w:pPr>
+      <w:r>
+        <w:t>Список А: то, что реально сделать в этом году (10-20 целей по SMART)</w:t>
+      </w:r>
+    </w:p>
+    <w:p>
+      <w:pPr>
+        <w:pStyle w:val="ListBullet"/>
+      </w:pPr>
+      <w:r>
+        <w:t>Список Б: далёкие желания без чёткого дедлайна - держите слайд, ждите возможности</w:t>
+      </w:r>
+    </w:p>
+    <w:p>
+      <w:pPr>
+        <w:pStyle w:val="ListBullet"/>
+      </w:pPr>
+      <w:r>
+        <w:t>Как только РАС найдёт путь - переносите из списка Б в список А</w:t>
+      </w:r>
+    </w:p>
+    <w:p>
+      <w:r>
+        <w:t>Научное подтверждение визуализации: австралийский психолог разделил баскетболистов на 3 группы на 20 дней. Группа 1 тренировалась физически, группа 2 ничего не делала, группа 3 только визуализировала штрафные броски. Результат: группы 1 и 3 показали примерно одинаковый прирост. Мозг не отличает реальный опыт от живого представления.</w:t>
+      </w:r>
+    </w:p>
+    <w:p>
+      <w:pPr>
+        <w:pStyle w:val="Heading3"/>
+      </w:pPr>
+      <w:r>
+        <w:t>Шаг 3 - Вытеснение (аффирмации)</w:t>
+      </w:r>
+    </w:p>
+    <w:p>
+      <w:r>
+        <w:t>Аффирмации - инструмент перезаписи негативных убеждений. Аналогия: стакан с колой (ваши текущие установки) + вливаете чистую воду = кола вытекает. Первые результаты через 2-4 месяца регулярной практики.</w:t>
+      </w:r>
+    </w:p>
+    <w:p>
+      <w:pPr>
+        <w:pStyle w:val="ListBullet"/>
+      </w:pPr>
+      <w:r>
+        <w:t>Аффирмации в настоящем времени: «Я величайший», а не «Я надеюсь стать»</w:t>
+      </w:r>
+    </w:p>
+    <w:p>
+      <w:pPr>
+        <w:pStyle w:val="ListBullet"/>
+      </w:pPr>
+      <w:r>
+        <w:t>Каждый день, от руки, можно левой рукой (активирует правое полушарие)</w:t>
+      </w:r>
+    </w:p>
+    <w:p>
+      <w:pPr>
+        <w:pStyle w:val="ListBullet"/>
+      </w:pPr>
+      <w:r>
+        <w:t>Без частицы не</w:t>
+      </w:r>
+    </w:p>
+    <w:p>
+      <w:r>
+        <w:t>Важно: аффирмации работают не сразу. Они постепенно вытесняют старую программу. Только тогда РАС начнёт видеть подтверждения в реальности.</w:t>
+      </w:r>
+    </w:p>
+    <w:p>
+      <w:pPr>
+        <w:pStyle w:val="Heading3"/>
+      </w:pPr>
+      <w:r>
+        <w:t>Ответственность и движение вперёд</w:t>
+      </w:r>
+    </w:p>
+    <w:p>
+      <w:pPr>
+        <w:pStyle w:val="ListBullet"/>
+      </w:pPr>
+      <w:r>
+        <w:t>Пока вы вините родителей, власть, друзей - вы не контролируете свою жизнь</w:t>
+      </w:r>
+    </w:p>
+    <w:p>
+      <w:pPr>
+        <w:pStyle w:val="ListBullet"/>
+      </w:pPr>
+      <w:r>
+        <w:t>Ситуация, в которой вы сейчас - результат ваших прошлых мыслей и действий</w:t>
+      </w:r>
+    </w:p>
+    <w:p>
+      <w:pPr>
+        <w:pStyle w:val="ListBullet"/>
+      </w:pPr>
+      <w:r>
+        <w:t>Принять ответственность = взять контроль</w:t>
+      </w:r>
+    </w:p>
+    <w:p>
+      <w:r>
+        <w:t>Про критику: амбиции всегда обнажают бездействие окружающих. Негативные комментарии - отражение их страха, а не оценка вашей цели.</w:t>
+      </w:r>
+    </w:p>
+    <w:p>
+      <w:r>
+        <w:t>«Мастер терпел неудачи больше раз, чем новичок вообще пытался.»</w:t>
+      </w:r>
+    </w:p>
+    <w:p>
+      <w:pPr>
+        <w:pStyle w:val="Heading3"/>
+      </w:pPr>
+      <w:r>
+        <w:t>Итоговая система на год</w:t>
+      </w:r>
+    </w:p>
+    <w:p>
+      <w:r>
+        <w:t>1. Написать от руки список желаний (список А + список Б)</w:t>
+      </w:r>
+    </w:p>
+    <w:p>
+      <w:r>
+        <w:t>2. Создать финальный слайд - живую визуализацию без жажды обладать</w:t>
+      </w:r>
+    </w:p>
+    <w:p>
+      <w:r>
+        <w:t>3. Поставить цели на год по SMART с дедлайнами</w:t>
+      </w:r>
+    </w:p>
+    <w:p>
+      <w:r>
+        <w:t>4. Разбить на квартальные задачи</w:t>
+      </w:r>
+    </w:p>
+    <w:p>
+      <w:r>
+        <w:t>5. Каждый день писать аффирмации (настоящее время, без не)</w:t>
+      </w:r>
+    </w:p>
+    <w:p>
+      <w:r>
+        <w:t>6. Двигаться к целям, не меняя слайд</w:t>
+      </w:r>
+    </w:p>
+    <w:p>
+      <w:r>
+        <w:rPr>
+          <w:b/>
+        </w:rPr>
+        <w:t>Рекомендуемые книги:</w:t>
+      </w:r>
+    </w:p>
+    <w:p>
+      <w:pPr>
+        <w:pStyle w:val="ListBullet"/>
+      </w:pPr>
+      <w:r>
+        <w:t>Вадим Зеланд «Трансёрфинг реальности»</w:t>
+      </w:r>
+    </w:p>
+    <w:p>
+      <w:pPr>
+        <w:pStyle w:val="ListBullet"/>
+      </w:pPr>
+      <w:r>
+        <w:t>Наполеон Хилл «Думай и богатей»</w:t>
+      </w:r>
+    </w:p>
+    <w:p>
+      <w:pPr>
+        <w:pStyle w:val="ListBullet"/>
+      </w:pPr>
+      <w:r>
+        <w:t>Джо Диспенза (любая книга)</w:t>
+      </w:r>
+    </w:p>
+    <w:p>
+      <w:pPr>
+        <w:pStyle w:val="ListBullet"/>
+      </w:pPr>
+      <w:r>
+        <w:t>«Самый богатый человек в Вавилоне»</w:t>
+      </w:r>
+    </w:p>
+    <w:p>
+      <w:pPr>
+        <w:pStyle w:val="Heading3"/>
+      </w:pPr>
+      <w:r>
+        <w:t>Связь с трейдингом</w:t>
+      </w:r>
+    </w:p>
+    <w:p>
+      <w:r>
+        <w:rPr>
+          <w:b/>
+        </w:rPr>
+        <w:t xml:space="preserve">РАС и сетапы: </w:t>
+      </w:r>
+      <w:r>
+        <w:t>когда вы знаете свой паттерн, вы начинаете видеть его на графике - мозг фильтрует именно его</w:t>
+      </w:r>
+    </w:p>
+    <w:p>
+      <w:r>
+        <w:rPr>
+          <w:b/>
+        </w:rPr>
+        <w:t xml:space="preserve">Слайд без жажды обладать: </w:t>
+      </w:r>
+      <w:r>
+        <w:t>торговля ради процесса, а не ради конкретной сделки - именно это позволяет не тильтовать</w:t>
+      </w:r>
+    </w:p>
+    <w:p>
+      <w:r>
+        <w:rPr>
+          <w:b/>
+        </w:rPr>
+        <w:t xml:space="preserve">Аффирмации и уверенность: </w:t>
+      </w:r>
+      <w:r>
+        <w:t>уверенность в системе строится через бэктест и аффирмации, а не через результат одной сделки</w:t>
+      </w:r>
+    </w:p>
+    <w:p>
+      <w:r>
+        <w:rPr>
+          <w:b/>
+        </w:rPr>
+        <w:t xml:space="preserve">Ответственность: </w:t>
+      </w:r>
+      <w:r>
+        <w:t>убыток - это не рынок виноват, это ваше решение по вашей системе. Принять ответственность = улучшить систему</w:t>
+      </w:r>
+    </w:p>
+    <w:p>
+      <w:r>
+        <w:t>Раздел составлен на основе видео «99% трейдеров потеряют всё в 2026 (и как попасть в 1%)»</w:t>
       </w:r>
     </w:p>
     <w:sectPr>

</xml_diff>

<commit_message>
docs: add chapter on false breakout detection with SwipAnalyzer
Statistical approach to measuring sweep depth for better stop-loss
placement and entry timing on any asset and timeframe.

Co-Authored-By: Claude Sonnet 4.6 <noreply@anthropic.com>
</commit_message>
<xml_diff>
--- a/docs/Торговая система.docx
+++ b/docs/Торговая система.docx
@@ -3448,6 +3448,376 @@
     <w:p>
       <w:r>
         <w:t>Раздел составлен на основе видео «99% трейдеров потеряют всё в 2026 (и как попасть в 1%)»</w:t>
+      </w:r>
+    </w:p>
+    <w:p>
+      <w:r>
+        <w:t>────────────────────────────────────────</w:t>
+      </w:r>
+    </w:p>
+    <w:p>
+      <w:pPr>
+        <w:pStyle w:val="Heading2"/>
+      </w:pPr>
+      <w:r>
+        <w:t>Как ловить ложные пробои (самый мощный способ)</w:t>
+      </w:r>
+    </w:p>
+    <w:p>
+      <w:pPr>
+        <w:pStyle w:val="Heading3"/>
+      </w:pPr>
+      <w:r>
+        <w:t>Главная идея</w:t>
+      </w:r>
+    </w:p>
+    <w:p>
+      <w:r>
+        <w:t>Ложный пробой (свип) - один из ключевых сетапов в Smart Money торговле. Проблема: неизвестно, насколько глубоко цена зайдёт за уровень, прежде чем развернётся. Решение: собрать статистику по историческим свипам на конкретном инструменте и таймфрейме, вывести средние значения и использовать их как ориентир для входа и стоп-лосса.</w:t>
+      </w:r>
+    </w:p>
+    <w:p>
+      <w:pPr>
+        <w:pStyle w:val="Heading3"/>
+      </w:pPr>
+      <w:r>
+        <w:t>Индикатор SwipAnalyzer (TradingView, Pine Script)</w:t>
+      </w:r>
+    </w:p>
+    <w:p>
+      <w:r>
+        <w:t>Анализирует все свипы на выбранном активе и таймфрейме, выводит статистическую таблицу прямо на график.</w:t>
+      </w:r>
+    </w:p>
+    <w:p>
+      <w:r>
+        <w:rPr>
+          <w:b/>
+        </w:rPr>
+        <w:t>Что показывает таблица:</w:t>
+      </w:r>
+    </w:p>
+    <w:p>
+      <w:pPr>
+        <w:pStyle w:val="ListBullet"/>
+      </w:pPr>
+      <w:r>
+        <w:t>Количество свипов вверх / вниз - сколько всего свипов зафиксировано</w:t>
+      </w:r>
+    </w:p>
+    <w:p>
+      <w:pPr>
+        <w:pStyle w:val="ListBullet"/>
+      </w:pPr>
+      <w:r>
+        <w:t>Среднее - среднее значение глубины всех свипов (включая аномалии)</w:t>
+      </w:r>
+    </w:p>
+    <w:p>
+      <w:pPr>
+        <w:pStyle w:val="ListBullet"/>
+      </w:pPr>
+      <w:r>
+        <w:t>Медиана - среднее без учёта выбросов (без самых маленьких и самых больших)</w:t>
+      </w:r>
+    </w:p>
+    <w:p>
+      <w:pPr>
+        <w:pStyle w:val="ListBullet"/>
+      </w:pPr>
+      <w:r>
+        <w:t>Максимум / Минимум - самый глубокий и самый мелкий свип за историю</w:t>
+      </w:r>
+    </w:p>
+    <w:p>
+      <w:pPr>
+        <w:pStyle w:val="ListBullet"/>
+      </w:pPr>
+      <w:r>
+        <w:t>Оптимальный стоп-лосс - медиана + буфер 20% (настраивается)</w:t>
+      </w:r>
+    </w:p>
+    <w:p>
+      <w:r>
+        <w:t>Пример (EURUSD H1, 326 свипов): средняя глубина ~9 пунктов, оптимальный стоп для лонга 15 пунктов, для шорта 17 пунктов.</w:t>
+      </w:r>
+    </w:p>
+    <w:p>
+      <w:pPr>
+        <w:pStyle w:val="Heading3"/>
+      </w:pPr>
+      <w:r>
+        <w:t>Два режима работы</w:t>
+      </w:r>
+    </w:p>
+    <w:p>
+      <w:r>
+        <w:rPr>
+          <w:b/>
+        </w:rPr>
+        <w:t xml:space="preserve">Strict Mode включён: </w:t>
+      </w:r>
+      <w:r>
+        <w:t>только классические свипы одним фитилём, 6-7 пунктов. Консервативная статистика.</w:t>
+      </w:r>
+    </w:p>
+    <w:p>
+      <w:r>
+        <w:rPr>
+          <w:b/>
+        </w:rPr>
+        <w:t xml:space="preserve">Strict Mode выключен: </w:t>
+      </w:r>
+      <w:r>
+        <w:t>расширенные свипы несколькими свечами, 20-35 пунктов. Рекомендуемый режим для активной торговли.</w:t>
+      </w:r>
+    </w:p>
+    <w:p>
+      <w:pPr>
+        <w:pStyle w:val="Heading3"/>
+      </w:pPr>
+      <w:r>
+        <w:t>Настройки индикатора</w:t>
+      </w:r>
+    </w:p>
+    <w:p>
+      <w:r>
+        <w:rPr>
+          <w:b/>
+        </w:rPr>
+        <w:t xml:space="preserve">Strict Mode - </w:t>
+      </w:r>
+      <w:r>
+        <w:t>тип свипов. Рекомендация: выключить</w:t>
+      </w:r>
+    </w:p>
+    <w:p>
+      <w:r>
+        <w:rPr>
+          <w:b/>
+        </w:rPr>
+        <w:t xml:space="preserve">Pivot Left / Right - </w:t>
+      </w:r>
+      <w:r>
+        <w:t>свечи слева и справа для поиска свинга. Рекомендация: по умолчанию</w:t>
+      </w:r>
+    </w:p>
+    <w:p>
+      <w:r>
+        <w:rPr>
+          <w:b/>
+        </w:rPr>
+        <w:t xml:space="preserve">SwipBack - </w:t>
+      </w:r>
+      <w:r>
+        <w:t>сколько баров анализировать. Рекомендация: 100, по умолчанию</w:t>
+      </w:r>
+    </w:p>
+    <w:p>
+      <w:r>
+        <w:rPr>
+          <w:b/>
+        </w:rPr>
+        <w:t xml:space="preserve">Swip Filter - </w:t>
+      </w:r>
+      <w:r>
+        <w:t>сколько свечей составляют один свип. Рекомендация: 10-15</w:t>
+      </w:r>
+    </w:p>
+    <w:p>
+      <w:r>
+        <w:rPr>
+          <w:b/>
+        </w:rPr>
+        <w:t xml:space="preserve">Max Depth (ATR) - </w:t>
+      </w:r>
+      <w:r>
+        <w:t>максимальная глубина свипа в ATR. Рекомендация: 3-5</w:t>
+      </w:r>
+    </w:p>
+    <w:p>
+      <w:r>
+        <w:rPr>
+          <w:b/>
+        </w:rPr>
+        <w:t xml:space="preserve">ATR Length - </w:t>
+      </w:r>
+      <w:r>
+        <w:t>период ATR. Рекомендация: 14</w:t>
+      </w:r>
+    </w:p>
+    <w:p>
+      <w:r>
+        <w:rPr>
+          <w:b/>
+        </w:rPr>
+        <w:t xml:space="preserve">Confirmation Bars - </w:t>
+      </w:r>
+      <w:r>
+        <w:t>свечи для подтверждения алерта. Рекомендация: 1 для реальной торговли</w:t>
+      </w:r>
+    </w:p>
+    <w:p>
+      <w:r>
+        <w:rPr>
+          <w:b/>
+        </w:rPr>
+        <w:t xml:space="preserve">Min Return - </w:t>
+      </w:r>
+      <w:r>
+        <w:t>возврат цены для срабатывания алерта. Рекомендация: 0.1-0.2</w:t>
+      </w:r>
+    </w:p>
+    <w:p>
+      <w:pPr>
+        <w:pStyle w:val="Heading3"/>
+      </w:pPr>
+      <w:r>
+        <w:t>Как использовать в торговле</w:t>
+      </w:r>
+    </w:p>
+    <w:p>
+      <w:r>
+        <w:rPr>
+          <w:b/>
+        </w:rPr>
+        <w:t>Сценарий 1 - Вход лимитным ордером заранее:</w:t>
+      </w:r>
+    </w:p>
+    <w:p>
+      <w:pPr>
+        <w:pStyle w:val="ListBullet"/>
+      </w:pPr>
+      <w:r>
+        <w:t>Определить зону потенциального свипа (уровень, свинг-хай/лоу)</w:t>
+      </w:r>
+    </w:p>
+    <w:p>
+      <w:pPr>
+        <w:pStyle w:val="ListBullet"/>
+      </w:pPr>
+      <w:r>
+        <w:t>Посмотреть медианное значение глубины из таблицы</w:t>
+      </w:r>
+    </w:p>
+    <w:p>
+      <w:pPr>
+        <w:pStyle w:val="ListBullet"/>
+      </w:pPr>
+      <w:r>
+        <w:t>Выставить лимитный ордер: граница зоны + медианная глубина</w:t>
+      </w:r>
+    </w:p>
+    <w:p>
+      <w:pPr>
+        <w:pStyle w:val="ListBullet"/>
+      </w:pPr>
+      <w:r>
+        <w:t>Стоп-лосс = оптимальное значение из таблицы</w:t>
+      </w:r>
+    </w:p>
+    <w:p>
+      <w:r>
+        <w:rPr>
+          <w:b/>
+        </w:rPr>
+        <w:t>Сценарий 2 - Вход по подтверждению алерта:</w:t>
+      </w:r>
+    </w:p>
+    <w:p>
+      <w:pPr>
+        <w:pStyle w:val="ListBullet"/>
+      </w:pPr>
+      <w:r>
+        <w:t>Настроить алерт (Confirmation Bars = 1)</w:t>
+      </w:r>
+    </w:p>
+    <w:p>
+      <w:pPr>
+        <w:pStyle w:val="ListBullet"/>
+      </w:pPr>
+      <w:r>
+        <w:t>Как только индикатор фиксирует свип и первая свеча подтверждения закрывается - приходит оповещение</w:t>
+      </w:r>
+    </w:p>
+    <w:p>
+      <w:pPr>
+        <w:pStyle w:val="ListBullet"/>
+      </w:pPr>
+      <w:r>
+        <w:t>Зайти по рынку или лимиткой, стоп за зону свипа, тейк на 50% предыдущего диапазона</w:t>
+      </w:r>
+    </w:p>
+    <w:p>
+      <w:r>
+        <w:t>Ключевое преимущество: не нужно сидеть у экрана. Поставил план - ушёл - пришёл алерт - открыл терминал с телефона - нажал одну кнопку.</w:t>
+      </w:r>
+    </w:p>
+    <w:p>
+      <w:pPr>
+        <w:pStyle w:val="Heading3"/>
+      </w:pPr>
+      <w:r>
+        <w:t>Практические примеры</w:t>
+      </w:r>
+    </w:p>
+    <w:p>
+      <w:r>
+        <w:rPr>
+          <w:b/>
+        </w:rPr>
+        <w:t xml:space="preserve">EURUSD M15: </w:t>
+      </w:r>
+      <w:r>
+        <w:t>средний свип 8-9 пунктов. Лимитный ордер на глубину медианы. Стоп 14-15 пунктов, тейк на зону ликвидности.</w:t>
+      </w:r>
+    </w:p>
+    <w:p>
+      <w:r>
+        <w:rPr>
+          <w:b/>
+        </w:rPr>
+        <w:t xml:space="preserve">USDJPY D1 + H1: </w:t>
+      </w:r>
+      <w:r>
+        <w:t>на дневном средний свип 153 пункта. На H1: шорт 22 пункта, лонг 32 пункта. Точка входа: ордерблок + два равных максимума на 156.388.</w:t>
+      </w:r>
+    </w:p>
+    <w:p>
+      <w:pPr>
+        <w:pStyle w:val="Heading3"/>
+      </w:pPr>
+      <w:r>
+        <w:t>Применение к ORB-стратегии</w:t>
+      </w:r>
+    </w:p>
+    <w:p>
+      <w:pPr>
+        <w:pStyle w:val="ListBullet"/>
+      </w:pPr>
+      <w:r>
+        <w:t>Если цена пробивает границу ORB-диапазона фитилём - индикатор помогает понять, истинный это пробой или ложный</w:t>
+      </w:r>
+    </w:p>
+    <w:p>
+      <w:pPr>
+        <w:pStyle w:val="ListBullet"/>
+      </w:pPr>
+      <w:r>
+        <w:t>Медианная глубина свипа для Si/Br на M5 подскажет, куда ставить стоп-лосс, чтобы не попасть под ложный вынос</w:t>
+      </w:r>
+    </w:p>
+    <w:p>
+      <w:pPr>
+        <w:pStyle w:val="ListBullet"/>
+      </w:pPr>
+      <w:r>
+        <w:t>Можно собрать статистику по Si на M5 в 10:00-10:10 МСК - понять типичную глубину ложных пробоев в зоне ORB</w:t>
+      </w:r>
+    </w:p>
+    <w:p>
+      <w:r>
+        <w:t>Раздел составлен на основе видео «Как ловить ложные пробои (самый мощный способ)»</w:t>
       </w:r>
     </w:p>
     <w:sectPr>

</xml_diff>

<commit_message>
docs: add chapter on RR math, dispersion and Monte Carlo simulation
Covers expectancy formula, high-RR trap, winner effect, law of large
numbers for loss streaks, and Monte Carlo comparison of 1:5 vs 1:1 systems.

Co-Authored-By: Claude Sonnet 4.6 <noreply@anthropic.com>
</commit_message>
<xml_diff>
--- a/docs/Торговая система.docx
+++ b/docs/Торговая система.docx
@@ -3818,6 +3818,407 @@
     <w:p>
       <w:r>
         <w:t>Раздел составлен на основе видео «Как ловить ложные пробои (самый мощный способ)»</w:t>
+      </w:r>
+    </w:p>
+    <w:p>
+      <w:r>
+        <w:t>────────────────────────────────────────</w:t>
+      </w:r>
+    </w:p>
+    <w:p>
+      <w:pPr>
+        <w:pStyle w:val="Heading2"/>
+      </w:pPr>
+      <w:r>
+        <w:t>Самый простой способ стать прибыльным трейдером быстро</w:t>
+      </w:r>
+    </w:p>
+    <w:p>
+      <w:pPr>
+        <w:pStyle w:val="Heading3"/>
+      </w:pPr>
+      <w:r>
+        <w:t>Главный тезис</w:t>
+      </w:r>
+    </w:p>
+    <w:p>
+      <w:r>
+        <w:t>Высокий RR (1:5, 1:10) - миф, который разрушает трейдеров психологически. Реальный путь - найти золотую середину между RR и винрейтом, торговать с небольшим соотношением, но высоким процентом побед.</w:t>
+      </w:r>
+    </w:p>
+    <w:p>
+      <w:pPr>
+        <w:pStyle w:val="Heading3"/>
+      </w:pPr>
+      <w:r>
+        <w:t>Математическое ожидание (Expectancy)</w:t>
+      </w:r>
+    </w:p>
+    <w:p>
+      <w:r>
+        <w:t>Формула: Expectancy = (Winrate × Средний выигрыш) - (% проигрышей × Средний проигрыш)</w:t>
+      </w:r>
+    </w:p>
+    <w:p>
+      <w:r>
+        <w:t>Это математический закон, а не выбор: высокий RR = всегда низкий винрейт. Высокий винрейт = всегда низкий RR. По-другому не работает.</w:t>
+      </w:r>
+    </w:p>
+    <w:p>
+      <w:r>
+        <w:rPr>
+          <w:b/>
+        </w:rPr>
+        <w:t>Минимальный винрейт для выхода в ноль:</w:t>
+      </w:r>
+    </w:p>
+    <w:p>
+      <w:pPr>
+        <w:pStyle w:val="ListBullet"/>
+      </w:pPr>
+      <w:r>
+        <w:t>1:5 — около 17-20%</w:t>
+      </w:r>
+    </w:p>
+    <w:p>
+      <w:pPr>
+        <w:pStyle w:val="ListBullet"/>
+      </w:pPr>
+      <w:r>
+        <w:t>1:2 — около 33%</w:t>
+      </w:r>
+    </w:p>
+    <w:p>
+      <w:pPr>
+        <w:pStyle w:val="ListBullet"/>
+      </w:pPr>
+      <w:r>
+        <w:t>1:1 — около 50-52% (с учётом комиссий)</w:t>
+      </w:r>
+    </w:p>
+    <w:p>
+      <w:pPr>
+        <w:pStyle w:val="ListBullet"/>
+      </w:pPr>
+      <w:r>
+        <w:t>0.5:1 — около 67-80%</w:t>
+      </w:r>
+    </w:p>
+    <w:p>
+      <w:r>
+        <w:t>Для стабильного заработка при RR 1:1 нужен минимум 55-60% побед.</w:t>
+      </w:r>
+    </w:p>
+    <w:p>
+      <w:pPr>
+        <w:pStyle w:val="Heading3"/>
+      </w:pPr>
+      <w:r>
+        <w:t>Психологическая ловушка высокого RR</w:t>
+      </w:r>
+    </w:p>
+    <w:p>
+      <w:r>
+        <w:t>Эффект победителя - биологический механизм: победа выбрасывает тестостерон и дофамин, повышает уверенность и мотивацию, что ведёт к новой победе. Поражение запускает обратный цикл.</w:t>
+      </w:r>
+    </w:p>
+    <w:p>
+      <w:r>
+        <w:t>При стратегии 1:5 (25% WR) трейдер проигрывает 7 раз из 10. После серии 5-6 убытков мозг входит в тильт, трейдер нарушает правила и ищет новую стратегию - математика никогда не раскрывается.</w:t>
+      </w:r>
+    </w:p>
+    <w:p>
+      <w:r>
+        <w:t>Системы с RR 1:1 подпитывают дофамином намного чаще и создают цикл победа - победа.</w:t>
+      </w:r>
+    </w:p>
+    <w:p>
+      <w:pPr>
+        <w:pStyle w:val="Heading3"/>
+      </w:pPr>
+      <w:r>
+        <w:t>Аналогии из дикой природы</w:t>
+      </w:r>
+    </w:p>
+    <w:p>
+      <w:pPr>
+        <w:pStyle w:val="ListBullet"/>
+      </w:pPr>
+      <w:r>
+        <w:t>Белый медведь - WR 2-5%, позиционный трейдер, редкие сделки с огромным вознаграждением</w:t>
+      </w:r>
+    </w:p>
+    <w:p>
+      <w:pPr>
+        <w:pStyle w:val="ListBullet"/>
+      </w:pPr>
+      <w:r>
+        <w:t>Лев - WR ~14%, экстремальный трейдер</w:t>
+      </w:r>
+    </w:p>
+    <w:p>
+      <w:pPr>
+        <w:pStyle w:val="ListBullet"/>
+      </w:pPr>
+      <w:r>
+        <w:t>Бахромчатая летучая мышь (Панама) - WR 50%, 89% времени ждёт, атакует только при максимальной вероятности - оптимальная модель</w:t>
+      </w:r>
+    </w:p>
+    <w:p>
+      <w:r>
+        <w:t>Урок: ни один хищник не выигрывает 100% охот. Математика важнее частоты.</w:t>
+      </w:r>
+    </w:p>
+    <w:p>
+      <w:pPr>
+        <w:pStyle w:val="Heading3"/>
+      </w:pPr>
+      <w:r>
+        <w:t>Закон больших чисел и серии убытков</w:t>
+      </w:r>
+    </w:p>
+    <w:p>
+      <w:r>
+        <w:t>Серии убытков неизбежны при любом винрейте:</w:t>
+      </w:r>
+    </w:p>
+    <w:p>
+      <w:pPr>
+        <w:pStyle w:val="ListBullet"/>
+      </w:pPr>
+      <w:r>
+        <w:t>WR 20% - серия из 11 стопов подряд почти гарантирована</w:t>
+      </w:r>
+    </w:p>
+    <w:p>
+      <w:pPr>
+        <w:pStyle w:val="ListBullet"/>
+      </w:pPr>
+      <w:r>
+        <w:t>WR 50% - 97% вероятность словить 6 убытков подряд</w:t>
+      </w:r>
+    </w:p>
+    <w:p>
+      <w:pPr>
+        <w:pStyle w:val="ListBullet"/>
+      </w:pPr>
+      <w:r>
+        <w:t>WR 70% - ~10% вероятность 5 убытков подряд</w:t>
+      </w:r>
+    </w:p>
+    <w:p>
+      <w:r>
+        <w:t>Чем ниже WR, тем длиннее неизбежные серии стопов. При 1:5 (20% WR) серия из 11 стопов - норма. Принять это психологически почти невозможно.</w:t>
+      </w:r>
+    </w:p>
+    <w:p>
+      <w:pPr>
+        <w:pStyle w:val="Heading3"/>
+      </w:pPr>
+      <w:r>
+        <w:t>Дисперсия и симуляция Монте-Карло</w:t>
+      </w:r>
+    </w:p>
+    <w:p>
+      <w:r>
+        <w:rPr>
+          <w:b/>
+        </w:rPr>
+        <w:t xml:space="preserve">Сценарий 1 (RR 1:5, WR 25%): </w:t>
+      </w:r>
+      <w:r>
+        <w:t>старт 0k, риск 00, 1000 сделок. Все 100 симуляций в плюсе, НО разброс результатов от 0k до 50k - разница в 3 раза. Длинные просадки неизбежны.</w:t>
+      </w:r>
+    </w:p>
+    <w:p>
+      <w:r>
+        <w:rPr>
+          <w:b/>
+        </w:rPr>
+        <w:t xml:space="preserve">Сценарий 2 (RR 0.5:1, WR 80%): </w:t>
+      </w:r>
+      <w:r>
+        <w:t>разброс от 5k до 5k - разница ~30%. Кривая доходности плавная и предсказуемая.</w:t>
+      </w:r>
+    </w:p>
+    <w:p>
+      <w:r>
+        <w:rPr>
+          <w:b/>
+        </w:rPr>
+        <w:t>Практическая симуляция (RR 1:1, WR 53%, риск 1%):</w:t>
+      </w:r>
+    </w:p>
+    <w:p>
+      <w:pPr>
+        <w:pStyle w:val="ListBullet"/>
+      </w:pPr>
+      <w:r>
+        <w:t>Старт: 0 000</w:t>
+      </w:r>
+    </w:p>
+    <w:p>
+      <w:pPr>
+        <w:pStyle w:val="ListBullet"/>
+      </w:pPr>
+      <w:r>
+        <w:t>Через 3 года: 0 000</w:t>
+      </w:r>
+    </w:p>
+    <w:p>
+      <w:pPr>
+        <w:pStyle w:val="ListBullet"/>
+      </w:pPr>
+      <w:r>
+        <w:t>Общая доходность: ~300%</w:t>
+      </w:r>
+    </w:p>
+    <w:p>
+      <w:pPr>
+        <w:pStyle w:val="ListBullet"/>
+      </w:pPr>
+      <w:r>
+        <w:t>Годовая доходность: 30-50%</w:t>
+      </w:r>
+    </w:p>
+    <w:p>
+      <w:pPr>
+        <w:pStyle w:val="ListBullet"/>
+      </w:pPr>
+      <w:r>
+        <w:t>Макс. серия убытков: 8 подряд</w:t>
+      </w:r>
+    </w:p>
+    <w:p>
+      <w:pPr>
+        <w:pStyle w:val="ListBullet"/>
+      </w:pPr>
+      <w:r>
+        <w:t>Макс. серия побед: 9 подряд</w:t>
+      </w:r>
+    </w:p>
+    <w:p>
+      <w:r>
+        <w:t>Итог: всего 53% побед + 1% риск = 300% за 3 года. Без экзотических стратегий.</w:t>
+      </w:r>
+    </w:p>
+    <w:p>
+      <w:pPr>
+        <w:pStyle w:val="Heading3"/>
+      </w:pPr>
+      <w:r>
+        <w:t>Два типа боли в трейдинге</w:t>
+      </w:r>
+    </w:p>
+    <w:p>
+      <w:r>
+        <w:rPr>
+          <w:b/>
+        </w:rPr>
+        <w:t xml:space="preserve">Боль высокого RR (хроническая): </w:t>
+      </w:r>
+      <w:r>
+        <w:t>постоянные стопы, глубокие просадки, подорванная самооценка, тильт и нарушение правил.</w:t>
+      </w:r>
+    </w:p>
+    <w:p>
+      <w:r>
+        <w:rPr>
+          <w:b/>
+        </w:rPr>
+        <w:t xml:space="preserve">Боль низкого RR (острая, редкая): </w:t>
+      </w:r>
+      <w:r>
+        <w:t>иногда цена уходит дальше после выхода. Вы уже в прибыли, просто могло быть больше. Не разрушительная.</w:t>
+      </w:r>
+    </w:p>
+    <w:p>
+      <w:r>
+        <w:t>Выбор очевиден: лучше терпеть редкую острую боль, чем хроническую.</w:t>
+      </w:r>
+    </w:p>
+    <w:p>
+      <w:pPr>
+        <w:pStyle w:val="Heading3"/>
+      </w:pPr>
+      <w:r>
+        <w:t>Личная система автора</w:t>
+      </w:r>
+    </w:p>
+    <w:p>
+      <w:pPr>
+        <w:pStyle w:val="ListBullet"/>
+      </w:pPr>
+      <w:r>
+        <w:t>Соотношение: ~1:1,5 (золотое сечение)</w:t>
+      </w:r>
+    </w:p>
+    <w:p>
+      <w:pPr>
+        <w:pStyle w:val="ListBullet"/>
+      </w:pPr>
+      <w:r>
+        <w:t>Риск: 1% на сделку</w:t>
+      </w:r>
+    </w:p>
+    <w:p>
+      <w:pPr>
+        <w:pStyle w:val="ListBullet"/>
+      </w:pPr>
+      <w:r>
+        <w:t>Результат: ~40% годовых стабильно, несколько лет подряд</w:t>
+      </w:r>
+    </w:p>
+    <w:p>
+      <w:r>
+        <w:t>Небольшие соотношения дают больше сигналов, быстрое обучение, несколько сделок в день, сложный процент работает активнее.</w:t>
+      </w:r>
+    </w:p>
+    <w:p>
+      <w:pPr>
+        <w:pStyle w:val="Heading3"/>
+      </w:pPr>
+      <w:r>
+        <w:t>Связь с ORB-стратегией</w:t>
+      </w:r>
+    </w:p>
+    <w:p>
+      <w:r>
+        <w:t>ORB использует соотношение 1:2 при WR ~38%:</w:t>
+      </w:r>
+    </w:p>
+    <w:p>
+      <w:r>
+        <w:t>Expectancy = (0.38 × 2) - (0.62 × 1) = +0.14 на рубль риска</w:t>
+      </w:r>
+    </w:p>
+    <w:p>
+      <w:pPr>
+        <w:pStyle w:val="ListBullet"/>
+      </w:pPr>
+      <w:r>
+        <w:t>1:2 при 38% WR - математически обоснованный компромисс</w:t>
+      </w:r>
+    </w:p>
+    <w:p>
+      <w:pPr>
+        <w:pStyle w:val="ListBullet"/>
+      </w:pPr>
+      <w:r>
+        <w:t>Серии из 6-8 убытков подряд при 38% WR неизбежны - это норма, не повод менять стратегию</w:t>
+      </w:r>
+    </w:p>
+    <w:p>
+      <w:pPr>
+        <w:pStyle w:val="ListBullet"/>
+      </w:pPr>
+      <w:r>
+        <w:t>Робот убирает психологический фактор: не тильтует, не нарушает правила</w:t>
+      </w:r>
+    </w:p>
+    <w:p>
+      <w:r>
+        <w:t>Раздел составлен на основе видео «Самый простой способ стать прибыльным трейдером быстро»</w:t>
       </w:r>
     </w:p>
     <w:sectPr>

</xml_diff>

<commit_message>
docs: add chapter on backtested strategies (ICT, NY Breakout, Turtles)
ICT Unicorn fails mechanically; NY Breakout shows 213% in 6 years at 53%
WR; Turtle Trading reaches 2800-15000% with pyramiding on NASDAQ.

Co-Authored-By: Claude Sonnet 4.6 <noreply@anthropic.com>
</commit_message>
<xml_diff>
--- a/docs/Торговая система.docx
+++ b/docs/Торговая система.docx
@@ -4219,6 +4219,426 @@
     <w:p>
       <w:r>
         <w:t>Раздел составлен на основе видео «Самый простой способ стать прибыльным трейдером быстро»</w:t>
+      </w:r>
+    </w:p>
+    <w:p>
+      <w:r>
+        <w:t>────────────────────────────────────────</w:t>
+      </w:r>
+    </w:p>
+    <w:p>
+      <w:pPr>
+        <w:pStyle w:val="Heading2"/>
+      </w:pPr>
+      <w:r>
+        <w:t>Эта стратегия обгоняет рынок в 100 раз! (математически)</w:t>
+      </w:r>
+    </w:p>
+    <w:p>
+      <w:pPr>
+        <w:pStyle w:val="Heading3"/>
+      </w:pPr>
+      <w:r>
+        <w:t>Главная идея</w:t>
+      </w:r>
+    </w:p>
+    <w:p>
+      <w:r>
+        <w:t>Бэктест трёх стратегий на глубокой истории с реальным PineScript-кодом. Вывод: сложный SmartMoney без контекста не работает механически; простые пробойные системы обгоняют Buy and Hold в десятки и сотни раз.</w:t>
+      </w:r>
+    </w:p>
+    <w:p>
+      <w:pPr>
+        <w:pStyle w:val="Heading3"/>
+      </w:pPr>
+      <w:r>
+        <w:t>Стратегия 1 - ICT Unicorn Model (механически) - убыточна</w:t>
+      </w:r>
+    </w:p>
+    <w:p>
+      <w:r>
+        <w:rPr>
+          <w:b/>
+        </w:rPr>
+        <w:t>Правила ICT Unicorn:</w:t>
+      </w:r>
+    </w:p>
+    <w:p>
+      <w:pPr>
+        <w:pStyle w:val="ListBullet"/>
+      </w:pPr>
+      <w:r>
+        <w:t>Ждать формирования брейкера</w:t>
+      </w:r>
+    </w:p>
+    <w:p>
+      <w:pPr>
+        <w:pStyle w:val="ListBullet"/>
+      </w:pPr>
+      <w:r>
+        <w:t>Ждать пробоя и образования нового максимума/минимума</w:t>
+      </w:r>
+    </w:p>
+    <w:p>
+      <w:pPr>
+        <w:pStyle w:val="ListBullet"/>
+      </w:pPr>
+      <w:r>
+        <w:t>В той же зоне формируется FVG (Fair Value Gap)</w:t>
+      </w:r>
+    </w:p>
+    <w:p>
+      <w:pPr>
+        <w:pStyle w:val="ListBullet"/>
+      </w:pPr>
+      <w:r>
+        <w:t>При коррекции в FVG - вход в сделку</w:t>
+      </w:r>
+    </w:p>
+    <w:p>
+      <w:pPr>
+        <w:pStyle w:val="ListBullet"/>
+      </w:pPr>
+      <w:r>
+        <w:t>Стоп за зону, тейк 1:2</w:t>
+      </w:r>
+    </w:p>
+    <w:p>
+      <w:r>
+        <w:t>Результат бэктеста: стратегия УБЫТОЧНА на любом активе и любом таймфрейме. Протестировано на DAX, NASDAQ (M5, M15, M30, H1) - везде убыток.</w:t>
+      </w:r>
+    </w:p>
+    <w:p>
+      <w:r>
+        <w:t>Почему: скрипт видит только правила, но не контекст. Трейдер-человек может визуально отфильтровать слабые сетапы, увидеть ликвидность. SmartMoney работает только при анализе контекста. Без него - слив.</w:t>
+      </w:r>
+    </w:p>
+    <w:p>
+      <w:pPr>
+        <w:pStyle w:val="Heading3"/>
+      </w:pPr>
+      <w:r>
+        <w:t>Стратегия 2 - NY Breakout (ORB американской сессии)</w:t>
+      </w:r>
+    </w:p>
+    <w:p>
+      <w:r>
+        <w:rPr>
+          <w:b/>
+        </w:rPr>
+        <w:t>Правила:</w:t>
+      </w:r>
+    </w:p>
+    <w:p>
+      <w:pPr>
+        <w:pStyle w:val="ListBullet"/>
+      </w:pPr>
+      <w:r>
+        <w:t>9:30 NY (16:30 МСК) - открытие американской сессии</w:t>
+      </w:r>
+    </w:p>
+    <w:p>
+      <w:pPr>
+        <w:pStyle w:val="ListBullet"/>
+      </w:pPr>
+      <w:r>
+        <w:t>Зафиксировать диапазон первой 15-минутной свечи</w:t>
+      </w:r>
+    </w:p>
+    <w:p>
+      <w:pPr>
+        <w:pStyle w:val="ListBullet"/>
+      </w:pPr>
+      <w:r>
+        <w:t>Ждать, пока следующая свеча закроется телом выше или ниже диапазона</w:t>
+      </w:r>
+    </w:p>
+    <w:p>
+      <w:pPr>
+        <w:pStyle w:val="ListBullet"/>
+      </w:pPr>
+      <w:r>
+        <w:t>Войти в направлении пробоя, стоп за диапазон, тейк 1:1</w:t>
+      </w:r>
+    </w:p>
+    <w:p>
+      <w:r>
+        <w:rPr>
+          <w:b/>
+        </w:rPr>
+        <w:t>Результаты (NASDAQ, M15, с 2018 года):</w:t>
+      </w:r>
+    </w:p>
+    <w:p>
+      <w:pPr>
+        <w:pStyle w:val="ListBullet"/>
+      </w:pPr>
+      <w:r>
+        <w:t>Сделок: ~1700</w:t>
+      </w:r>
+    </w:p>
+    <w:p>
+      <w:pPr>
+        <w:pStyle w:val="ListBullet"/>
+      </w:pPr>
+      <w:r>
+        <w:t>Винрейт: 53%</w:t>
+      </w:r>
+    </w:p>
+    <w:p>
+      <w:pPr>
+        <w:pStyle w:val="ListBullet"/>
+      </w:pPr>
+      <w:r>
+        <w:t>Профит-фактор: 1.14</w:t>
+      </w:r>
+    </w:p>
+    <w:p>
+      <w:pPr>
+        <w:pStyle w:val="ListBullet"/>
+      </w:pPr>
+      <w:r>
+        <w:t>Общая доходность: 213%</w:t>
+      </w:r>
+    </w:p>
+    <w:p>
+      <w:pPr>
+        <w:pStyle w:val="ListBullet"/>
+      </w:pPr>
+      <w:r>
+        <w:t>Превышает Buy and Hold: да</w:t>
+      </w:r>
+    </w:p>
+    <w:p>
+      <w:pPr>
+        <w:pStyle w:val="ListBullet"/>
+      </w:pPr>
+      <w:r>
+        <w:t>Преимущество над рынком: всего 3-3.5%</w:t>
+      </w:r>
+    </w:p>
+    <w:p>
+      <w:r>
+        <w:rPr>
+          <w:b/>
+        </w:rPr>
+        <w:t>По инструментам:</w:t>
+      </w:r>
+    </w:p>
+    <w:p>
+      <w:pPr>
+        <w:pStyle w:val="ListBullet"/>
+      </w:pPr>
+      <w:r>
+        <w:t>NASDAQ M15 - каждый день пн-пт</w:t>
+      </w:r>
+    </w:p>
+    <w:p>
+      <w:pPr>
+        <w:pStyle w:val="ListBullet"/>
+      </w:pPr>
+      <w:r>
+        <w:t>DAX M25 - ~54% WR, аналогичный профит-фактор</w:t>
+      </w:r>
+    </w:p>
+    <w:p>
+      <w:pPr>
+        <w:pStyle w:val="ListBullet"/>
+      </w:pPr>
+      <w:r>
+        <w:t>Крипта M15 - только понедельник и пятница, лучше RR 1:2</w:t>
+      </w:r>
+    </w:p>
+    <w:p>
+      <w:r>
+        <w:t>Важно: работает только на индексах и криптовалюте, не для Форекса.</w:t>
+      </w:r>
+    </w:p>
+    <w:p>
+      <w:r>
+        <w:t>Для пропфирмы: максимальная серия убытков - 5 подряд. При риске 1% и лимите просадки 10% стратегия проходит челлендж с вероятностью ~90%.</w:t>
+      </w:r>
+    </w:p>
+    <w:p>
+      <w:pPr>
+        <w:pStyle w:val="Heading3"/>
+      </w:pPr>
+      <w:r>
+        <w:t>Стратегия 3 - Черепахи (Turtle Trading, модифицированная)</w:t>
+      </w:r>
+    </w:p>
+    <w:p>
+      <w:r>
+        <w:t>Основана на книге «Путь черепах» Куртиса Фейта. Оригинал: покупать на пробое 20-дневного максимума, продавать на пробое 20-дневного минимума.</w:t>
+      </w:r>
+    </w:p>
+    <w:p>
+      <w:r>
+        <w:rPr>
+          <w:b/>
+        </w:rPr>
+        <w:t>Модификации:</w:t>
+      </w:r>
+    </w:p>
+    <w:p>
+      <w:pPr>
+        <w:pStyle w:val="ListBullet"/>
+      </w:pPr>
+      <w:r>
+        <w:t>Добавлен пирамидинг - наращивание позиции на движении</w:t>
+      </w:r>
+    </w:p>
+    <w:p>
+      <w:pPr>
+        <w:pStyle w:val="ListBullet"/>
+      </w:pPr>
+      <w:r>
+        <w:t>Динамический выход - не фиксированный тейк, а выход по структуре</w:t>
+      </w:r>
+    </w:p>
+    <w:p>
+      <w:pPr>
+        <w:pStyle w:val="ListBullet"/>
+      </w:pPr>
+      <w:r>
+        <w:t>В тестируемой версии только лонги</w:t>
+      </w:r>
+    </w:p>
+    <w:p>
+      <w:r>
+        <w:rPr>
+          <w:b/>
+        </w:rPr>
+        <w:t>Результаты бэктеста:</w:t>
+      </w:r>
+    </w:p>
+    <w:p>
+      <w:pPr>
+        <w:pStyle w:val="ListBullet"/>
+      </w:pPr>
+      <w:r>
+        <w:t>NASDAQ H1: 2800%, ~51% WR, PF 1.9</w:t>
+      </w:r>
+    </w:p>
+    <w:p>
+      <w:pPr>
+        <w:pStyle w:val="ListBullet"/>
+      </w:pPr>
+      <w:r>
+        <w:t>NASDAQ M15: 15000%, ~1000 сделок</w:t>
+      </w:r>
+    </w:p>
+    <w:p>
+      <w:pPr>
+        <w:pStyle w:val="ListBullet"/>
+      </w:pPr>
+      <w:r>
+        <w:t>S&amp;P 500 H4: ~500%</w:t>
+      </w:r>
+    </w:p>
+    <w:p>
+      <w:pPr>
+        <w:pStyle w:val="ListBullet"/>
+      </w:pPr>
+      <w:r>
+        <w:t>Bitcoin H1: высокая доходность, ~51% WR</w:t>
+      </w:r>
+    </w:p>
+    <w:p>
+      <w:r>
+        <w:t>Пережил пандемию 2020 с прибылью. Просадку 2021-2022 отторговал около нуля, затем быстро восстановился. Работает без оптимизации.</w:t>
+      </w:r>
+    </w:p>
+    <w:p>
+      <w:r>
+        <w:t>Как работает: покупает на пробое хая -&gt; на коррекции выходит -&gt; пересиживает без позиции -&gt; откупает на следующем пробое -&gt; нарастает пирамидой -&gt; закрывается -&gt; ждёт -&gt; повторяет.</w:t>
+      </w:r>
+    </w:p>
+    <w:p>
+      <w:pPr>
+        <w:pStyle w:val="Heading3"/>
+      </w:pPr>
+      <w:r>
+        <w:t>Ключевые выводы</w:t>
+      </w:r>
+    </w:p>
+    <w:p>
+      <w:pPr>
+        <w:pStyle w:val="ListBullet"/>
+      </w:pPr>
+      <w:r>
+        <w:t>ICT/SmartMoney без контекста = убыток. Механическая реализация нежизнеспособна.</w:t>
+      </w:r>
+    </w:p>
+    <w:p>
+      <w:pPr>
+        <w:pStyle w:val="ListBullet"/>
+      </w:pPr>
+      <w:r>
+        <w:t>NY Breakout - простейшая механическая стратегия: 53% WR, RR 1:1, 213% за 6 лет. Подходит для роботизации.</w:t>
+      </w:r>
+    </w:p>
+    <w:p>
+      <w:pPr>
+        <w:pStyle w:val="ListBullet"/>
+      </w:pPr>
+      <w:r>
+        <w:t>Turtle Strategy - «скучная» стратегия, 2800-15000% на индексах без оптимизации.</w:t>
+      </w:r>
+    </w:p>
+    <w:p>
+      <w:pPr>
+        <w:pStyle w:val="ListBullet"/>
+      </w:pPr>
+      <w:r>
+        <w:t>Чтобы обогнать рынок, достаточно превосходства в 3-4%. На дистанции это сотни процентов.</w:t>
+      </w:r>
+    </w:p>
+    <w:p>
+      <w:pPr>
+        <w:pStyle w:val="ListBullet"/>
+      </w:pPr>
+      <w:r>
+        <w:t>Просадки и стагнации неизбежны - это математика, не провал системы.</w:t>
+      </w:r>
+    </w:p>
+    <w:p>
+      <w:pPr>
+        <w:pStyle w:val="Heading3"/>
+      </w:pPr>
+      <w:r>
+        <w:t>Связь с ORB-стратегией проекта</w:t>
+      </w:r>
+    </w:p>
+    <w:p>
+      <w:r>
+        <w:t>NY Breakout - это ORB для американской сессии (9:30 NY). Наша стратегия использует тот же принцип для российской сессии (10:00 МСК).</w:t>
+      </w:r>
+    </w:p>
+    <w:p>
+      <w:pPr>
+        <w:pStyle w:val="ListBullet"/>
+      </w:pPr>
+      <w:r>
+        <w:t>NY Breakout: 16:30 МСК, 1 свеча M15, тейк 1:1, без фильтра, индексы и крипта</w:t>
+      </w:r>
+    </w:p>
+    <w:p>
+      <w:pPr>
+        <w:pStyle w:val="ListBullet"/>
+      </w:pPr>
+      <w:r>
+        <w:t>ORB MOEX: 10:00 МСК, 2 свечи M5, тейк 1:2, фильтр VWAP, Si и Br</w:t>
+      </w:r>
+    </w:p>
+    <w:p>
+      <w:r>
+        <w:t>Данные NY Breakout (213% за 6 лет, 53% WR) косвенно подтверждают жизнеспособность ORB-подхода для MOEX - тот же класс стратегий, другие параметры.</w:t>
+      </w:r>
+    </w:p>
+    <w:p>
+      <w:r>
+        <w:t>Раздел составлен на основе видео «Эта стратегия обгоняет рынок в 100 раз! (математически)»</w:t>
       </w:r>
     </w:p>
     <w:sectPr>

</xml_diff>